<commit_message>
Place article citations at paragraph end; clean heading separator
Co-Authored-By: Claude <noreply@anthropic.com>
</commit_message>
<xml_diff>
--- a/תלקיט ניהול גן מרווא.docx
+++ b/תלקיט ניהול גן מרווא.docx
@@ -3634,7 +3634,7 @@
           <w:szCs w:val="24"/>
           <w:rtl w:val="1"/>
         </w:rPr>
-        <w:t>מעבר לחצר עצמה, מחקר שבחן תפיסות של גננות לגבי למידה חוץ-גנית בסביבה הטבעית מצא שהגננות רואות בסביבה הטבעית מרחב שמרגיע את הילדים, מזמן להם לפתור קונפליקטים בשיח ולא באלימות, ומעודד שיתוף פעולה ולמידה אותנטית (כדורי-שלזק וסטוק, 2024). בשביל גן שאחד היעדים המרכזיים שלו הוא צמצום אלימות, יציאה קבועה לסביבה הטבעית הקרובה יכולה להיות כלי ממשי ולא רק העשרה, וזה מתחבר גם לתפיסת הגן העתידי שהמחקר נשען עליה.</w:t>
+        <w:t>מעבר לחצר עצמה, כדאי לחשוב על יציאה קבועה לסביבה הטבעית הקרובה. בשביל גן שאחד היעדים המרכזיים שלו הוא צמצום אלימות, זה יכול להיות כלי ממשי ולא רק העשרה, וזה מתחבר גם לתפיסת הגן העתידי. מחקר שבחן תפיסות של גננות לגבי למידה חוץ-גנית בסביבה הטבעית מצא שהגננות רואות בסביבה הטבעית מרחב שמרגיע את הילדים, מזמן להם לפתור קונפליקטים בשיח ולא באלימות, ומעודד שיתוף פעולה ולמידה אותנטית (כדורי-שלזק וסטוק, 2024).</w:t>
       </w:r>
     </w:p>
     <w:p>
@@ -3765,7 +3765,25 @@
           <w:szCs w:val="24"/>
           <w:rtl w:val="1"/>
         </w:rPr>
-        <w:t>החוסר שהכי בלט לי הוא בשעות של אנשי מקצוע תומכים. בגן עם שלושים וחמישה ילדים, בלי סייעת חינוכית ובלי שעות קבועות של יועצת או מטפלת רגשית, לילה והצוות סופגים לבד את כל העומס הרגשי וההתנהגותי. חסר גם ציוד לחצר, וחומרים דו-לשוניים בעברית ובערבית שיתמכו ביעד של צמצום הפערים בשפה. מחקר שבחן את מערך הייעוץ החינוכי לגיל הרך מצא שהייעוץ מסייע לגננות להתמודד עם אתגרים טכנולוגיים ומשפחתיים ועם שילוב ילדים עם צרכים מיוחדים, ותורם לפיתוח מקצועי של הצוות, אך הוא תלוי בתקצוב שעות ייעוץ ובתמיכת הפיקוח (אבוחצירא ובארט, תשפ"ג). זהו בדיוק סוג המשאב שחסר בגן אשכול, ושכדאי לפעול לגייס.</w:t>
+        <w:t>החוסר שהכי בלט לי הוא בשעות של אנשי מקצוע תומכים. בגן עם שלושים וחמישה ילדים, בלי סייעת חינוכית ובלי שעות קבועות של יועצת או מטפלת רגשית, לילה והצוות סופגים לבד את כל העומס הרגשי וההתנהגותי. חסר גם ציוד לחצר, וחומרים דו-לשוניים בעברית ובערבית שיתמכו ביעד של צמצום הפערים בשפה. זהו בדיוק סוג המשאב שחסר בגן אשכול, ושכדאי לפעול לגייס.</w:t>
+      </w:r>
+    </w:p>
+    <w:p>
+      <w:pPr>
+        <w:bidi w:val="1"/>
+        <w:spacing w:line="360" w:lineRule="auto" w:after="160"/>
+        <w:jc w:val="both"/>
+      </w:pPr>
+      <w:r>
+        <w:rPr>
+          <w:rFonts w:ascii="David" w:hAnsi="David" w:cs="David"/>
+          <w:b w:val="0"/>
+          <w:i w:val="0"/>
+          <w:sz w:val="24"/>
+          <w:szCs w:val="24"/>
+          <w:rtl w:val="1"/>
+        </w:rPr>
+        <w:t>החוסר הזה בשעות תמיכה איננו רק תחושה שלי. מחקר שבחן את מערך הייעוץ החינוכי לגיל הרך מצא שהייעוץ מסייע לגננות להתמודד עם אתגרים טכנולוגיים ומשפחתיים ועם שילוב ילדים עם צרכים מיוחדים, ותורם לפיתוח מקצועי של הצוות, אך הוא תלוי בתקצוב שעות ייעוץ ובתמיכת הפיקוח (אבוחצירא ובארט, תשפ"ג).</w:t>
       </w:r>
     </w:p>
     <w:p>
@@ -5280,7 +5298,7 @@
           <w:szCs w:val="30"/>
           <w:rtl w:val="1"/>
         </w:rPr>
-        <w:t>מרכיב 7: ניהול זמן-תכנית עבודה מנהלית</w:t>
+        <w:t>מרכיב 7: ניהול זמן, תכנית עבודה מנהלית</w:t>
       </w:r>
     </w:p>
     <w:p>

</xml_diff>

<commit_message>
Reference the two articles in more body sections (staff, daily schedule), citation at paragraph end
Co-Authored-By: Claude <noreply@anthropic.com>
</commit_message>
<xml_diff>
--- a/תלקיט ניהול גן מרווא.docx
+++ b/תלקיט ניהול גן מרווא.docx
@@ -4543,6 +4543,24 @@
     <w:p>
       <w:pPr>
         <w:bidi w:val="1"/>
+        <w:spacing w:line="360" w:lineRule="auto" w:after="160"/>
+        <w:jc w:val="both"/>
+      </w:pPr>
+      <w:r>
+        <w:rPr>
+          <w:rFonts w:ascii="David" w:hAnsi="David" w:cs="David"/>
+          <w:b w:val="0"/>
+          <w:i w:val="0"/>
+          <w:sz w:val="24"/>
+          <w:szCs w:val="24"/>
+          <w:rtl w:val="1"/>
+        </w:rPr>
+        <w:t>חשוב לזכור שהמנהלת לא צריכה לשאת בזה לבד. מחקר על מערך הייעוץ החינוכי לגיל הרך מצא שהייעוץ נותן לגננות ולצוות תמיכה מקצועית בהתמודדות עם אתגרים, ותורם לפיתוח מקצועי צוותי, כך שמנהלת שמזהה עובדת נשחקת יכולה להיעזר ביועצת ובפיקוח ולא רק בכוחות עצמה (אבוחצירא ובארט, תשפ"ג).</w:t>
+      </w:r>
+    </w:p>
+    <w:p>
+      <w:pPr>
+        <w:bidi w:val="1"/>
         <w:spacing w:line="360" w:lineRule="auto" w:after="80"/>
         <w:jc w:val="both"/>
       </w:pPr>
@@ -5276,6 +5294,24 @@
           <w:rtl w:val="1"/>
         </w:rPr>
         <w:t>התובנה הראשונה מתחברת ישירות למה שנלמד במצגת על ניהול הזמן, שהזמן בגן אינו נקבע לפי השעון אלא לפי שלושה שיקולים שנפגשים, השיקול הפדגוגי של הצוות, צרכי הילדים, וההזדמנויות שעולות במהלך היום. גננת טובה יודעת מתי לוותר על מה שתכננה כי קרה משהו חשוב יותר. התובנה השנייה היא שסדר יום צפוי הוא כלי לניהול התנהגות. ראיתי שדווקא בימים שבהם השגרה נשמרה היו פחות חיכוכים בין הילדים, וזה מתחבר ליעד של לילה לצמצם אלימות וגם למטרות שהוצגו בקורס, יצירת שגרה בטוחה והפחתת מעברים חדים. כלים חזותיים כמו לוח יום מצויר וטיימר צבעוני, שנלמדו במצגת, עוזרים לילדים להבין את המעברים ומורידים את המתח סביבם.</w:t>
+      </w:r>
+    </w:p>
+    <w:p>
+      <w:pPr>
+        <w:bidi w:val="1"/>
+        <w:spacing w:line="360" w:lineRule="auto" w:after="160"/>
+        <w:jc w:val="both"/>
+      </w:pPr>
+      <w:r>
+        <w:rPr>
+          <w:rFonts w:ascii="David" w:hAnsi="David" w:cs="David"/>
+          <w:b w:val="0"/>
+          <w:i w:val="0"/>
+          <w:sz w:val="24"/>
+          <w:szCs w:val="24"/>
+          <w:rtl w:val="1"/>
+        </w:rPr>
+        <w:t>נקודה נוספת שקשורה לסדר היום היא הזמן בחצר ובסביבה. הבנתי שהשעה בחוץ איננה רק הפסקה מהלמידה. מחקר על תפיסות של גננות לגבי למידה בסביבה הטבעית מצא שהסביבה הזאת מרגיעה את הילדים ומאפשרת להם לפתור מריבות בשיח ולא באלימות, ולכן שווה לשריין לה מקום קבוע בסדר היום ולא לוותר עליה בלחץ הזמן (כדורי-שלזק וסטוק, 2024).</w:t>
       </w:r>
     </w:p>
     <w:p>

</xml_diff>